<commit_message>
docs: Regenerate PDF/DOCX/TEX with updated DOIs
</commit_message>
<xml_diff>
--- a/docs/TELOS_Academic_Paper_Final.docx
+++ b/docs/TELOS_Academic_Paper_Final.docx
@@ -8711,7 +8711,7 @@
         <w:t xml:space="preserve"> </w:t>
       </w:r>
       <w:r>
-        <w:t xml:space="preserve">Zenodo, 2025. https://doi.org/10.5281/zenodo.18027446</w:t>
+        <w:t xml:space="preserve">Zenodo, 2025. https://doi.org/10.5281/zenodo.18370504</w:t>
       </w:r>
     </w:p>
     <w:p>
@@ -8751,7 +8751,7 @@
         <w:t xml:space="preserve"> </w:t>
       </w:r>
       <w:r>
-        <w:t xml:space="preserve">Zenodo, 2026. https://doi.org/10.5281/zenodo.18013104</w:t>
+        <w:t xml:space="preserve">Zenodo, 2026. https://doi.org/10.5281/zenodo.18370659</w:t>
       </w:r>
     </w:p>
     <w:p>

</xml_diff>